<commit_message>
trying to add the google search icon
</commit_message>
<xml_diff>
--- a/src/assets/Brian_Kamwera_ReactJS_Developer_CV.docx
+++ b/src/assets/Brian_Kamwera_ReactJS_Developer_CV.docx
@@ -482,6 +482,82 @@
         <w:rPr>
           <w:rFonts w:ascii="Times New Roman" w:hAnsi="Times New Roman" w:cs="Times New Roman"/>
         </w:rPr>
+        <w:t>Axios</w:t>
+      </w:r>
+    </w:p>
+    <w:p>
+      <w:pPr>
+        <w:pStyle w:val="ListParagraph"/>
+        <w:numPr>
+          <w:ilvl w:val="0"/>
+          <w:numId w:val="10"/>
+        </w:numPr>
+        <w:rPr>
+          <w:rFonts w:ascii="Times New Roman" w:hAnsi="Times New Roman" w:cs="Times New Roman"/>
+        </w:rPr>
+      </w:pPr>
+      <w:proofErr w:type="spellStart"/>
+      <w:r>
+        <w:rPr>
+          <w:rFonts w:ascii="Times New Roman" w:hAnsi="Times New Roman" w:cs="Times New Roman"/>
+        </w:rPr>
+        <w:t>Emailjs</w:t>
+      </w:r>
+      <w:proofErr w:type="spellEnd"/>
+    </w:p>
+    <w:p>
+      <w:pPr>
+        <w:pStyle w:val="ListParagraph"/>
+        <w:numPr>
+          <w:ilvl w:val="0"/>
+          <w:numId w:val="10"/>
+        </w:numPr>
+        <w:rPr>
+          <w:rFonts w:ascii="Times New Roman" w:hAnsi="Times New Roman" w:cs="Times New Roman"/>
+        </w:rPr>
+      </w:pPr>
+      <w:proofErr w:type="spellStart"/>
+      <w:r>
+        <w:rPr>
+          <w:rFonts w:ascii="Times New Roman" w:hAnsi="Times New Roman" w:cs="Times New Roman"/>
+        </w:rPr>
+        <w:t>Websockets</w:t>
+      </w:r>
+      <w:proofErr w:type="spellEnd"/>
+    </w:p>
+    <w:p>
+      <w:pPr>
+        <w:pStyle w:val="ListParagraph"/>
+        <w:numPr>
+          <w:ilvl w:val="0"/>
+          <w:numId w:val="10"/>
+        </w:numPr>
+        <w:rPr>
+          <w:rFonts w:ascii="Times New Roman" w:hAnsi="Times New Roman" w:cs="Times New Roman"/>
+        </w:rPr>
+      </w:pPr>
+      <w:r>
+        <w:rPr>
+          <w:rFonts w:ascii="Times New Roman" w:hAnsi="Times New Roman" w:cs="Times New Roman"/>
+        </w:rPr>
+        <w:t>Web security</w:t>
+      </w:r>
+    </w:p>
+    <w:p>
+      <w:pPr>
+        <w:pStyle w:val="ListParagraph"/>
+        <w:numPr>
+          <w:ilvl w:val="0"/>
+          <w:numId w:val="10"/>
+        </w:numPr>
+        <w:rPr>
+          <w:rFonts w:ascii="Times New Roman" w:hAnsi="Times New Roman" w:cs="Times New Roman"/>
+        </w:rPr>
+      </w:pPr>
+      <w:r>
+        <w:rPr>
+          <w:rFonts w:ascii="Times New Roman" w:hAnsi="Times New Roman" w:cs="Times New Roman"/>
+        </w:rPr>
         <w:t xml:space="preserve"> Microsoft Excel, Word, Access, Publisher</w:t>
       </w:r>
     </w:p>
@@ -580,6 +656,26 @@
         </w:rPr>
         <w:t>irebase</w:t>
       </w:r>
+      <w:r>
+        <w:rPr>
+          <w:rFonts w:ascii="Times New Roman" w:hAnsi="Times New Roman" w:cs="Times New Roman"/>
+        </w:rPr>
+        <w:t xml:space="preserve"> (authentication, </w:t>
+      </w:r>
+      <w:proofErr w:type="spellStart"/>
+      <w:r>
+        <w:rPr>
+          <w:rFonts w:ascii="Times New Roman" w:hAnsi="Times New Roman" w:cs="Times New Roman"/>
+        </w:rPr>
+        <w:t>firestore</w:t>
+      </w:r>
+      <w:proofErr w:type="spellEnd"/>
+      <w:r>
+        <w:rPr>
+          <w:rFonts w:ascii="Times New Roman" w:hAnsi="Times New Roman" w:cs="Times New Roman"/>
+        </w:rPr>
+        <w:t>, Al and deployment)</w:t>
+      </w:r>
     </w:p>
     <w:p>
       <w:pPr>
@@ -601,6 +697,33 @@
     </w:p>
     <w:p>
       <w:pPr>
+        <w:pStyle w:val="ListParagraph"/>
+        <w:numPr>
+          <w:ilvl w:val="0"/>
+          <w:numId w:val="10"/>
+        </w:numPr>
+        <w:rPr>
+          <w:rFonts w:ascii="Times New Roman" w:hAnsi="Times New Roman" w:cs="Times New Roman"/>
+        </w:rPr>
+      </w:pPr>
+      <w:proofErr w:type="spellStart"/>
+      <w:r>
+        <w:rPr>
+          <w:rFonts w:ascii="Times New Roman" w:hAnsi="Times New Roman" w:cs="Times New Roman"/>
+        </w:rPr>
+        <w:lastRenderedPageBreak/>
+        <w:t>Vercel</w:t>
+      </w:r>
+      <w:proofErr w:type="spellEnd"/>
+      <w:r>
+        <w:rPr>
+          <w:rFonts w:ascii="Times New Roman" w:hAnsi="Times New Roman" w:cs="Times New Roman"/>
+        </w:rPr>
+        <w:t xml:space="preserve"> (for deployment)</w:t>
+      </w:r>
+    </w:p>
+    <w:p>
+      <w:pPr>
         <w:rPr>
           <w:rFonts w:ascii="Times New Roman" w:hAnsi="Times New Roman" w:cs="Times New Roman"/>
           <w:b/>
@@ -679,7 +802,6 @@
           <w:sz w:val="28"/>
           <w:szCs w:val="28"/>
         </w:rPr>
-        <w:lastRenderedPageBreak/>
         <w:t>Projects</w:t>
       </w:r>
     </w:p>
@@ -697,7 +819,7 @@
           <w:b/>
           <w:bCs/>
         </w:rPr>
-        <w:t xml:space="preserve">Simple messenger </w:t>
+        <w:t>e-</w:t>
       </w:r>
       <w:proofErr w:type="gramStart"/>
       <w:r>
@@ -706,7 +828,7 @@
           <w:b/>
           <w:bCs/>
         </w:rPr>
-        <w:t>app</w:t>
+        <w:t>commerce</w:t>
       </w:r>
       <w:r>
         <w:rPr>
@@ -717,6 +839,24 @@
         <w:t xml:space="preserve">  (</w:t>
       </w:r>
       <w:proofErr w:type="gramEnd"/>
+      <w:r>
+        <w:rPr>
+          <w:rFonts w:ascii="Times New Roman" w:hAnsi="Times New Roman" w:cs="Times New Roman"/>
+          <w:b/>
+          <w:bCs/>
+        </w:rPr>
+        <w:t xml:space="preserve">available on </w:t>
+      </w:r>
+      <w:proofErr w:type="spellStart"/>
+      <w:r>
+        <w:rPr>
+          <w:rFonts w:ascii="Times New Roman" w:hAnsi="Times New Roman" w:cs="Times New Roman"/>
+          <w:b/>
+          <w:bCs/>
+        </w:rPr>
+        <w:t>portifolio</w:t>
+      </w:r>
+      <w:proofErr w:type="spellEnd"/>
       <w:r>
         <w:rPr>
           <w:rFonts w:ascii="Times New Roman" w:hAnsi="Times New Roman" w:cs="Times New Roman"/>
@@ -748,7 +888,23 @@
           <w:b/>
           <w:bCs/>
         </w:rPr>
-        <w:t xml:space="preserve"> ()</w:t>
+        <w:t xml:space="preserve"> (</w:t>
+      </w:r>
+      <w:r>
+        <w:rPr>
+          <w:rFonts w:ascii="Times New Roman" w:hAnsi="Times New Roman" w:cs="Times New Roman"/>
+          <w:b/>
+          <w:bCs/>
+        </w:rPr>
+        <w:t>not published</w:t>
+      </w:r>
+      <w:r>
+        <w:rPr>
+          <w:rFonts w:ascii="Times New Roman" w:hAnsi="Times New Roman" w:cs="Times New Roman"/>
+          <w:b/>
+          <w:bCs/>
+        </w:rPr>
+        <w:t>)</w:t>
       </w:r>
     </w:p>
     <w:p>
@@ -765,7 +921,25 @@
           <w:b/>
           <w:bCs/>
         </w:rPr>
-        <w:t>Softkhlome website</w:t>
+        <w:t xml:space="preserve">Simple </w:t>
+      </w:r>
+      <w:proofErr w:type="spellStart"/>
+      <w:r>
+        <w:rPr>
+          <w:rFonts w:ascii="Times New Roman" w:hAnsi="Times New Roman" w:cs="Times New Roman"/>
+          <w:b/>
+          <w:bCs/>
+        </w:rPr>
+        <w:t>Travelist</w:t>
+      </w:r>
+      <w:proofErr w:type="spellEnd"/>
+      <w:r>
+        <w:rPr>
+          <w:rFonts w:ascii="Times New Roman" w:hAnsi="Times New Roman" w:cs="Times New Roman"/>
+          <w:b/>
+          <w:bCs/>
+        </w:rPr>
+        <w:t xml:space="preserve"> (</w:t>
       </w:r>
       <w:r>
         <w:rPr>
@@ -773,7 +947,25 @@
           <w:b/>
           <w:bCs/>
         </w:rPr>
-        <w:t xml:space="preserve"> ()</w:t>
+        <w:t xml:space="preserve">available on </w:t>
+      </w:r>
+      <w:proofErr w:type="spellStart"/>
+      <w:r>
+        <w:rPr>
+          <w:rFonts w:ascii="Times New Roman" w:hAnsi="Times New Roman" w:cs="Times New Roman"/>
+          <w:b/>
+          <w:bCs/>
+        </w:rPr>
+        <w:t>portifolio</w:t>
+      </w:r>
+      <w:proofErr w:type="spellEnd"/>
+      <w:r>
+        <w:rPr>
+          <w:rFonts w:ascii="Times New Roman" w:hAnsi="Times New Roman" w:cs="Times New Roman"/>
+          <w:b/>
+          <w:bCs/>
+        </w:rPr>
+        <w:t>)</w:t>
       </w:r>
     </w:p>
     <w:p>

</xml_diff>

<commit_message>
Checkpoint from VS Code for cloud agent session
</commit_message>
<xml_diff>
--- a/src/assets/Brian_Kamwera_ReactJS_Developer_CV.docx
+++ b/src/assets/Brian_Kamwera_ReactJS_Developer_CV.docx
@@ -496,14 +496,12 @@
           <w:rFonts w:ascii="Times New Roman" w:hAnsi="Times New Roman" w:cs="Times New Roman"/>
         </w:rPr>
       </w:pPr>
-      <w:proofErr w:type="spellStart"/>
       <w:r>
         <w:rPr>
           <w:rFonts w:ascii="Times New Roman" w:hAnsi="Times New Roman" w:cs="Times New Roman"/>
         </w:rPr>
         <w:t>Emailjs</w:t>
       </w:r>
-      <w:proofErr w:type="spellEnd"/>
     </w:p>
     <w:p>
       <w:pPr>
@@ -516,14 +514,12 @@
           <w:rFonts w:ascii="Times New Roman" w:hAnsi="Times New Roman" w:cs="Times New Roman"/>
         </w:rPr>
       </w:pPr>
-      <w:proofErr w:type="spellStart"/>
       <w:r>
         <w:rPr>
           <w:rFonts w:ascii="Times New Roman" w:hAnsi="Times New Roman" w:cs="Times New Roman"/>
         </w:rPr>
-        <w:t>Websockets</w:t>
+        <w:t>WebSocket’s</w:t>
       </w:r>
-      <w:proofErr w:type="spellEnd"/>
     </w:p>
     <w:p>
       <w:pPr>
@@ -660,21 +656,7 @@
         <w:rPr>
           <w:rFonts w:ascii="Times New Roman" w:hAnsi="Times New Roman" w:cs="Times New Roman"/>
         </w:rPr>
-        <w:t xml:space="preserve"> (authentication, </w:t>
-      </w:r>
-      <w:proofErr w:type="spellStart"/>
-      <w:r>
-        <w:rPr>
-          <w:rFonts w:ascii="Times New Roman" w:hAnsi="Times New Roman" w:cs="Times New Roman"/>
-        </w:rPr>
-        <w:t>firestore</w:t>
-      </w:r>
-      <w:proofErr w:type="spellEnd"/>
-      <w:r>
-        <w:rPr>
-          <w:rFonts w:ascii="Times New Roman" w:hAnsi="Times New Roman" w:cs="Times New Roman"/>
-        </w:rPr>
-        <w:t>, Al and deployment)</w:t>
+        <w:t xml:space="preserve"> (authentication, firestore, Al and deployment)</w:t>
       </w:r>
     </w:p>
     <w:p>

</xml_diff>